<commit_message>
Add profile headshot and update work history
</commit_message>
<xml_diff>
--- a/Lindsey_English_Jr_Resume.docx
+++ b/Lindsey_English_Jr_Resume.docx
@@ -63,7 +63,7 @@
         </w:rPr>
         <w:t xml:space="preserve">  •  </w:t>
       </w:r>
-      <w:hyperlink w:history="1" r:id="rIdfh9xmm4eh7vkwnlzpl767">
+      <w:hyperlink w:history="1" r:id="rIdfscsjdl3besb7ec9ux-bp">
         <w:r>
           <w:rPr>
             <w:rStyle w:val="Hyperlink"/>
@@ -84,7 +84,7 @@
         </w:rPr>
         <w:t xml:space="preserve">  •  </w:t>
       </w:r>
-      <w:hyperlink w:history="1" r:id="rIduvcrwmk-ga9swprxlsb57">
+      <w:hyperlink w:history="1" r:id="rIdd3mnvnwmm-vxsacbxzjcq">
         <w:r>
           <w:rPr>
             <w:rStyle w:val="Hyperlink"/>
@@ -105,7 +105,7 @@
         </w:rPr>
         <w:t xml:space="preserve">  •  </w:t>
       </w:r>
-      <w:hyperlink w:history="1" r:id="rId9olnwi6tedpbzf_6wq3o7">
+      <w:hyperlink w:history="1" r:id="rIdkezphjmhxdcsx-xcmvac9">
         <w:r>
           <w:rPr>
             <w:rStyle w:val="Hyperlink"/>
@@ -314,6 +314,115 @@
           <w:szCs w:val="20"/>
         </w:rPr>
         <w:t xml:space="preserve">Apply classroom networking and cybersecurity knowledge directly to live production systems.</w:t>
+      </w:r>
+    </w:p>
+    <w:p>
+      <w:pPr>
+        <w:tabs>
+          <w:tab w:val="right" w:pos="9026"/>
+        </w:tabs>
+        <w:spacing w:after="40" w:before="160"/>
+      </w:pPr>
+      <w:r>
+        <w:rPr>
+          <w:rFonts w:ascii="Arial" w:cs="Arial" w:eastAsia="Arial" w:hAnsi="Arial"/>
+          <w:b/>
+          <w:bCs/>
+          <w:color w:val="1E1B4B"/>
+          <w:sz w:val="22"/>
+          <w:szCs w:val="22"/>
+        </w:rPr>
+        <w:t xml:space="preserve">Tacoma Community College — Information Commons</w:t>
+      </w:r>
+      <w:r>
+        <w:rPr>
+          <w:rFonts w:ascii="Arial" w:cs="Arial" w:eastAsia="Arial" w:hAnsi="Arial"/>
+        </w:rPr>
+        <w:t xml:space="preserve">	</w:t>
+      </w:r>
+      <w:r>
+        <w:rPr>
+          <w:rFonts w:ascii="Arial" w:cs="Arial" w:eastAsia="Arial" w:hAnsi="Arial"/>
+          <w:i/>
+          <w:iCs/>
+          <w:color w:val="555577"/>
+          <w:sz w:val="20"/>
+          <w:szCs w:val="20"/>
+        </w:rPr>
+        <w:t xml:space="preserve">2024</w:t>
+      </w:r>
+    </w:p>
+    <w:p>
+      <w:pPr>
+        <w:spacing w:after="40" w:before="0"/>
+      </w:pPr>
+      <w:r>
+        <w:rPr>
+          <w:rFonts w:ascii="Arial" w:cs="Arial" w:eastAsia="Arial" w:hAnsi="Arial"/>
+          <w:b/>
+          <w:bCs/>
+          <w:color w:val="111111"/>
+          <w:sz w:val="21"/>
+          <w:szCs w:val="21"/>
+        </w:rPr>
+        <w:t xml:space="preserve">Help Desk Technician</w:t>
+      </w:r>
+    </w:p>
+    <w:p>
+      <w:pPr>
+        <w:pStyle w:val="ListParagraph"/>
+        <w:numPr>
+          <w:ilvl w:val="0"/>
+          <w:numId w:val="2"/>
+        </w:numPr>
+        <w:spacing w:after="20" w:before="20"/>
+      </w:pPr>
+      <w:r>
+        <w:rPr>
+          <w:rFonts w:ascii="Arial" w:cs="Arial" w:eastAsia="Arial" w:hAnsi="Arial"/>
+          <w:color w:val="111111"/>
+          <w:sz w:val="20"/>
+          <w:szCs w:val="20"/>
+        </w:rPr>
+        <w:t xml:space="preserve">Provided front-line technical support to students and staff at the Information Commons help desk.</w:t>
+      </w:r>
+    </w:p>
+    <w:p>
+      <w:pPr>
+        <w:pStyle w:val="ListParagraph"/>
+        <w:numPr>
+          <w:ilvl w:val="0"/>
+          <w:numId w:val="2"/>
+        </w:numPr>
+        <w:spacing w:after="20" w:before="20"/>
+      </w:pPr>
+      <w:r>
+        <w:rPr>
+          <w:rFonts w:ascii="Arial" w:cs="Arial" w:eastAsia="Arial" w:hAnsi="Arial"/>
+          <w:color w:val="111111"/>
+          <w:sz w:val="20"/>
+          <w:szCs w:val="20"/>
+        </w:rPr>
+        <w:t xml:space="preserve">Assisted with device troubleshooting, software issues, printing, and general technology inquiries.</w:t>
+      </w:r>
+    </w:p>
+    <w:p>
+      <w:pPr>
+        <w:pStyle w:val="ListParagraph"/>
+        <w:numPr>
+          <w:ilvl w:val="0"/>
+          <w:numId w:val="2"/>
+        </w:numPr>
+        <w:spacing w:after="20" w:before="20"/>
+      </w:pPr>
+      <w:r>
+        <w:rPr>
+          <w:rFonts w:ascii="Arial" w:cs="Arial" w:eastAsia="Arial" w:hAnsi="Arial"/>
+          <w:color w:val="111111"/>
+          <w:sz w:val="20"/>
+          <w:szCs w:val="20"/>
+        </w:rPr>
+        <w:t xml:space="preserve">Delivered patient, clear support in a high-traffic public environment — skills that led directly to a role in TCC's IT Department.</w:t>
       </w:r>
     </w:p>
     <w:p>

</xml_diff>